<commit_message>
Add author byline to journal manuscript
- Author block (Nicolas Guerrero, centered under the bilingual titles)
  added to manuscrito_epp.md via @@AUTOR@@ markers; generator renders
  them centered
- generar_docx_epp.py now patches settings.xml zoom attribute after save
  so the .docx passes OOXML schema validation on every regeneration
- Affiliation set to 'Investigador independiente' and personal email,
  flagged in LISTA_COMPROBACION.md for author confirmation (maternal
  surname / second name still needed for the journal's normalized
  signature format)

Co-Authored-By: Claude Fable 5 <noreply@anthropic.com>
</commit_message>
<xml_diff>
--- a/policy_paper/envio_estudios_politicas_publicas/manuscrito_epp.docx
+++ b/policy_paper/envio_estudios_politicas_publicas/manuscrito_epp.docx
@@ -26,6 +26,36 @@
           <w:sz w:val="24"/>
         </w:rPr>
         <w:t>Same occupation, different pay: the gender wage gap that composition does not explain in Chile</w:t>
+      </w:r>
+    </w:p>
+    <w:p>
+      <w:pPr>
+        <w:spacing w:after="40"/>
+        <w:jc w:val="center"/>
+      </w:pPr>
+      <w:r>
+        <w:rPr>
+          <w:b/>
+        </w:rPr>
+        <w:t>Nicolás Guerrero</w:t>
+      </w:r>
+    </w:p>
+    <w:p>
+      <w:pPr>
+        <w:spacing w:after="40"/>
+        <w:jc w:val="center"/>
+      </w:pPr>
+      <w:r>
+        <w:t>Investigador independiente</w:t>
+      </w:r>
+    </w:p>
+    <w:p>
+      <w:pPr>
+        <w:spacing w:after="40"/>
+        <w:jc w:val="center"/>
+      </w:pPr>
+      <w:r>
+        <w:t>n.icolashrra@gmail.com</w:t>
       </w:r>
     </w:p>
     <w:p>

</xml_diff>

<commit_message>
Remove repository CSV reference from paper body (all versions)
Dropped the sentence pointing readers to
ranking_brecha_ocupacion_ajustada.csv in the repository — a code/data
artifact reference that does not belong in an academic manuscript.
Removed from the Spanish and English papers and the journal .docx;
PDF and .docx regenerated.

Co-Authored-By: Claude Fable 5 <noreply@anthropic.com>
</commit_message>
<xml_diff>
--- a/policy_paper/envio_estudios_politicas_publicas/manuscrito_epp.docx
+++ b/policy_paper/envio_estudios_politicas_publicas/manuscrito_epp.docx
@@ -2998,24 +2998,6 @@
           <w:sz w:val="20"/>
         </w:rPr>
         <w:t>Nota: Cada punto representa una ocupación CIUO-08 a 4 dígitos. En rojo, ocupaciones con brecha ajustada estadísticamente significativa (p &lt; .05); en gris, no significativas. Fuente: elaboración propia a partir de CASEN 2022 y 2024.</w:t>
-      </w:r>
-    </w:p>
-    <w:p>
-      <w:pPr>
-        <w:jc w:val="both"/>
-      </w:pPr>
-      <w:r>
-        <w:t xml:space="preserve">La distribución completa (227 ocupaciones, con brecha cruda, ajustada, valor p corregido por FDR y tamaños muestrales) está publicada como dato abierto en </w:t>
-      </w:r>
-      <w:r>
-        <w:rPr>
-          <w:rFonts w:ascii="Courier New" w:hAnsi="Courier New"/>
-          <w:sz w:val="20"/>
-        </w:rPr>
-        <w:t>ranking_brecha_ocupacion_ajustada.csv</w:t>
-      </w:r>
-      <w:r>
-        <w:t>.</w:t>
       </w:r>
     </w:p>
     <w:p>

</xml_diff>